<commit_message>
Update Dec 18 2024
</commit_message>
<xml_diff>
--- a/doc/CV_WSong.docx
+++ b/doc/CV_WSong.docx
@@ -176,7 +176,25 @@
               <w:rPr>
                 <w:rFonts w:eastAsia="Calibri"/>
               </w:rPr>
-              <w:t xml:space="preserve">ws787@msstate.edu         </w:t>
+              <w:t>song.wentao</w:t>
+            </w:r>
+            <w:r>
+              <w:rPr>
+                <w:rFonts w:eastAsia="Calibri"/>
+              </w:rPr>
+              <w:t>@</w:t>
+            </w:r>
+            <w:r>
+              <w:rPr>
+                <w:rFonts w:eastAsia="Calibri"/>
+              </w:rPr>
+              <w:t>outlook.com</w:t>
+            </w:r>
+            <w:r>
+              <w:rPr>
+                <w:rFonts w:eastAsia="Calibri"/>
+              </w:rPr>
+              <w:t xml:space="preserve">         </w:t>
             </w:r>
             <w:r>
               <w:rPr>
@@ -282,12 +300,6 @@
               <w:rPr>
                 <w:rFonts w:eastAsia="Calibri"/>
               </w:rPr>
-              <w:t>https://</w:t>
-            </w:r>
-            <w:r>
-              <w:rPr>
-                <w:rFonts w:eastAsia="Calibri"/>
-              </w:rPr>
               <w:t>song-wentao.github.io</w:t>
             </w:r>
           </w:p>
@@ -342,7 +354,19 @@
               <w:rPr>
                 <w:rFonts w:eastAsia="Calibri"/>
               </w:rPr>
-              <w:t>I am a final-year PhD candidate at Mississippi State University, majoring in Natural Resources, with an anticipated graduation date of December 2024. With 13 years of training as a wildlife ecologist, my educational background includes comprehensive training in biology and ecology for wildlife management. My master’s research focused on how global changes affect the behavioral responses and population dynamics of small mammals. My doctoral research centers on using statistical models and machine learning to analyze the spatiotemporal dynamics of North American breeding bird populations. I have participated in various projects involving birds, rodents, deer, and primates. My interest lies in using statistical models and machine learning methods to analyze, model, and predict population dynamics, thereby contributing to wildlife management and conservation.</w:t>
+              <w:t xml:space="preserve">I am </w:t>
+            </w:r>
+            <w:r>
+              <w:rPr>
+                <w:rFonts w:eastAsia="Calibri"/>
+              </w:rPr>
+              <w:t>a PhD candidate at Mississippi State University</w:t>
+            </w:r>
+            <w:r>
+              <w:rPr>
+                <w:rFonts w:eastAsia="Calibri"/>
+              </w:rPr>
+              <w:t>, majoring in Natural Resources, with an anticipated graduation date of December 2024. With 13 years of training as a wildlife ecologist, my educational background includes comprehensive training in biology and ecology for wildlife management. My master’s research focused on how global changes affect the behavioral responses and population dynamics of small mammals. My doctoral research centers on using statistical models and machine learning to analyze the spatiotemporal dynamics of North American breeding bird populations. I have participated in various projects involving birds, rodents, deer, and primates. My interest lies in using statistical models and machine learning methods to analyze, model, and predict population dynamics, thereby contributing to wildlife management and conservation.</w:t>
             </w:r>
           </w:p>
         </w:tc>
@@ -483,22 +507,36 @@
               <w:rPr>
                 <w:rFonts w:eastAsia="Calibri"/>
               </w:rPr>
-              <w:t>PhD. Natural Resources, Wildlife, Fishery and aquaculture concentration</w:t>
-            </w:r>
-          </w:p>
-          <w:p>
-            <w:pPr>
-              <w:widowControl w:val="0"/>
-              <w:spacing w:after="0" w:line="240" w:lineRule="auto"/>
-              <w:rPr>
-                <w:rFonts w:eastAsia="Calibri"/>
-              </w:rPr>
-            </w:pPr>
-            <w:r>
-              <w:rPr>
-                <w:rFonts w:eastAsia="Calibri"/>
-              </w:rPr>
-              <w:t>Supervisor: Dr. Guiming Wang</w:t>
+              <w:t>PhD. Natural Resources, Wildlife concentration</w:t>
+            </w:r>
+          </w:p>
+          <w:p>
+            <w:pPr>
+              <w:widowControl w:val="0"/>
+              <w:spacing w:after="0" w:line="240" w:lineRule="auto"/>
+              <w:rPr>
+                <w:rFonts w:eastAsia="Calibri"/>
+              </w:rPr>
+            </w:pPr>
+            <w:r>
+              <w:rPr>
+                <w:rFonts w:eastAsia="Calibri"/>
+              </w:rPr>
+              <w:t xml:space="preserve">Supervisor: Dr. </w:t>
+            </w:r>
+            <w:proofErr w:type="spellStart"/>
+            <w:r>
+              <w:rPr>
+                <w:rFonts w:eastAsia="Calibri"/>
+              </w:rPr>
+              <w:t>Guiming</w:t>
+            </w:r>
+            <w:proofErr w:type="spellEnd"/>
+            <w:r>
+              <w:rPr>
+                <w:rFonts w:eastAsia="Calibri"/>
+              </w:rPr>
+              <w:t xml:space="preserve"> Wang</w:t>
             </w:r>
           </w:p>
           <w:p>
@@ -612,7 +650,21 @@
               <w:rPr>
                 <w:rFonts w:eastAsia="Calibri"/>
               </w:rPr>
-              <w:t>Supervisor: Dr. Zihui Zhang</w:t>
+              <w:t xml:space="preserve">Supervisor: Dr. </w:t>
+            </w:r>
+            <w:proofErr w:type="spellStart"/>
+            <w:r>
+              <w:rPr>
+                <w:rFonts w:eastAsia="Calibri"/>
+              </w:rPr>
+              <w:t>Zihui</w:t>
+            </w:r>
+            <w:proofErr w:type="spellEnd"/>
+            <w:r>
+              <w:rPr>
+                <w:rFonts w:eastAsia="Calibri"/>
+              </w:rPr>
+              <w:t xml:space="preserve"> Zhang</w:t>
             </w:r>
           </w:p>
           <w:p>
@@ -726,7 +778,21 @@
               <w:rPr>
                 <w:rFonts w:eastAsia="Calibri"/>
               </w:rPr>
-              <w:t>Supervisor: Dr. Xinrong Wan</w:t>
+              <w:t xml:space="preserve">Supervisor: Dr. </w:t>
+            </w:r>
+            <w:proofErr w:type="spellStart"/>
+            <w:r>
+              <w:rPr>
+                <w:rFonts w:eastAsia="Calibri"/>
+              </w:rPr>
+              <w:t>Xinrong</w:t>
+            </w:r>
+            <w:proofErr w:type="spellEnd"/>
+            <w:r>
+              <w:rPr>
+                <w:rFonts w:eastAsia="Calibri"/>
+              </w:rPr>
+              <w:t xml:space="preserve"> Wan</w:t>
             </w:r>
           </w:p>
           <w:p>
@@ -821,11 +887,45 @@
                 <w:rFonts w:ascii="Calibri" w:eastAsia="Calibri" w:hAnsi="Calibri"/>
               </w:rPr>
             </w:pPr>
-            <w:r>
-              <w:rPr>
-                <w:rFonts w:eastAsia="Calibri"/>
-              </w:rPr>
-              <w:t>BSc(Agr). Aquaculture</w:t>
+            <w:proofErr w:type="gramStart"/>
+            <w:r>
+              <w:rPr>
+                <w:rFonts w:eastAsia="Calibri"/>
+              </w:rPr>
+              <w:t>BS</w:t>
+            </w:r>
+            <w:r>
+              <w:rPr>
+                <w:rFonts w:eastAsia="Calibri"/>
+              </w:rPr>
+              <w:t>c</w:t>
+            </w:r>
+            <w:r>
+              <w:rPr>
+                <w:rFonts w:eastAsia="Calibri"/>
+              </w:rPr>
+              <w:t>(</w:t>
+            </w:r>
+            <w:proofErr w:type="spellStart"/>
+            <w:proofErr w:type="gramEnd"/>
+            <w:r>
+              <w:rPr>
+                <w:rFonts w:eastAsia="Calibri"/>
+              </w:rPr>
+              <w:t>Agr</w:t>
+            </w:r>
+            <w:proofErr w:type="spellEnd"/>
+            <w:r>
+              <w:rPr>
+                <w:rFonts w:eastAsia="Calibri"/>
+              </w:rPr>
+              <w:t>.</w:t>
+            </w:r>
+            <w:r>
+              <w:rPr>
+                <w:rFonts w:eastAsia="Calibri"/>
+              </w:rPr>
+              <w:t>) Aquaculture</w:t>
             </w:r>
           </w:p>
         </w:tc>
@@ -996,7 +1096,13 @@
                 <w:b/>
                 <w:bCs/>
               </w:rPr>
-              <w:t xml:space="preserve">Mississippi State University  </w:t>
+              <w:t>Mississippi State University</w:t>
+            </w:r>
+            <w:r>
+              <w:rPr>
+                <w:rFonts w:eastAsia="Calibri"/>
+              </w:rPr>
+              <w:t xml:space="preserve">  </w:t>
             </w:r>
             <w:r>
               <w:rPr>
@@ -1025,7 +1131,7 @@
               <w:widowControl w:val="0"/>
               <w:spacing w:after="0" w:line="240" w:lineRule="auto"/>
               <w:rPr>
-                <w:rFonts w:ascii="Calibri" w:eastAsia="Calibri" w:hAnsi="Calibri"/>
+                <w:rFonts w:eastAsia="Calibri"/>
               </w:rPr>
             </w:pPr>
             <w:r>
@@ -1034,6 +1140,15 @@
               </w:rPr>
               <w:t>Assisted instructors in preparing lectures and labs for undergraduate students.</w:t>
             </w:r>
+          </w:p>
+          <w:p>
+            <w:pPr>
+              <w:widowControl w:val="0"/>
+              <w:spacing w:after="0" w:line="240" w:lineRule="auto"/>
+              <w:rPr>
+                <w:rFonts w:ascii="Calibri" w:eastAsia="Calibri" w:hAnsi="Calibri"/>
+              </w:rPr>
+            </w:pPr>
           </w:p>
         </w:tc>
         <w:tc>
@@ -1106,7 +1221,13 @@
                 <w:b/>
                 <w:bCs/>
               </w:rPr>
-              <w:t xml:space="preserve">Northwestern University      </w:t>
+              <w:t>Northwestern University</w:t>
+            </w:r>
+            <w:r>
+              <w:rPr>
+                <w:rFonts w:eastAsia="Calibri"/>
+              </w:rPr>
+              <w:t xml:space="preserve">      </w:t>
             </w:r>
             <w:r>
               <w:rPr>
@@ -1400,15 +1521,39 @@
               <w:spacing w:after="0" w:line="240" w:lineRule="auto"/>
               <w:ind w:left="720"/>
               <w:rPr>
-                <w:rFonts w:ascii="Calibri" w:eastAsia="Calibri" w:hAnsi="Calibri"/>
-              </w:rPr>
-            </w:pPr>
-            <w:r>
-              <w:rPr>
-                <w:rFonts w:eastAsia="Calibri"/>
-              </w:rPr>
-              <w:t>Bayesian analysis with PyMC3, WinBUGS, JAGS, and Stan</w:t>
-            </w:r>
+                <w:rFonts w:eastAsia="Calibri"/>
+              </w:rPr>
+            </w:pPr>
+            <w:r>
+              <w:rPr>
+                <w:rFonts w:eastAsia="Calibri"/>
+              </w:rPr>
+              <w:t xml:space="preserve">Bayesian analysis with PyMC3, </w:t>
+            </w:r>
+            <w:proofErr w:type="spellStart"/>
+            <w:r>
+              <w:rPr>
+                <w:rFonts w:eastAsia="Calibri"/>
+              </w:rPr>
+              <w:t>WinBUGS</w:t>
+            </w:r>
+            <w:proofErr w:type="spellEnd"/>
+            <w:r>
+              <w:rPr>
+                <w:rFonts w:eastAsia="Calibri"/>
+              </w:rPr>
+              <w:t>, JAGS, and Stan</w:t>
+            </w:r>
+          </w:p>
+          <w:p>
+            <w:pPr>
+              <w:widowControl w:val="0"/>
+              <w:spacing w:after="0" w:line="240" w:lineRule="auto"/>
+              <w:ind w:left="720"/>
+              <w:rPr>
+                <w:rFonts w:ascii="Calibri" w:eastAsia="Calibri" w:hAnsi="Calibri"/>
+              </w:rPr>
+            </w:pPr>
           </w:p>
           <w:p>
             <w:pPr>
@@ -1425,6 +1570,7 @@
                 <w:b/>
                 <w:bCs/>
               </w:rPr>
+              <w:lastRenderedPageBreak/>
               <w:t>TEACHING</w:t>
             </w:r>
           </w:p>
@@ -1457,7 +1603,6 @@
               <w:rPr>
                 <w:rFonts w:eastAsia="Calibri"/>
               </w:rPr>
-              <w:lastRenderedPageBreak/>
               <w:t>Ecology, Population Ecology, and Community Ecology</w:t>
             </w:r>
           </w:p>
@@ -1936,8 +2081,9 @@
             <w:pPr>
               <w:widowControl w:val="0"/>
               <w:spacing w:after="0" w:line="240" w:lineRule="auto"/>
-              <w:rPr>
-                <w:rFonts w:ascii="Calibri" w:eastAsia="Calibri" w:hAnsi="Calibri"/>
+              <w:ind w:left="720" w:hanging="720"/>
+              <w:rPr>
+                <w:rFonts w:eastAsia="Calibri"/>
               </w:rPr>
             </w:pPr>
             <w:r>
@@ -1951,8 +2097,9 @@
             <w:pPr>
               <w:widowControl w:val="0"/>
               <w:spacing w:after="0" w:line="240" w:lineRule="auto"/>
-              <w:rPr>
-                <w:rFonts w:ascii="Calibri" w:eastAsia="Calibri" w:hAnsi="Calibri"/>
+              <w:ind w:left="720" w:hanging="720"/>
+              <w:rPr>
+                <w:rFonts w:eastAsia="Calibri"/>
               </w:rPr>
             </w:pPr>
             <w:r>
@@ -1966,83 +2113,145 @@
             <w:pPr>
               <w:widowControl w:val="0"/>
               <w:spacing w:after="0" w:line="240" w:lineRule="auto"/>
-              <w:rPr>
-                <w:rFonts w:ascii="Calibri" w:eastAsia="Calibri" w:hAnsi="Calibri"/>
-              </w:rPr>
-            </w:pPr>
-            <w:r>
-              <w:rPr>
-                <w:rFonts w:eastAsia="Calibri"/>
-              </w:rPr>
-              <w:t xml:space="preserve">    (1)The IUCN red list of threatened species: How it’s being used.</w:t>
-            </w:r>
-          </w:p>
-          <w:p>
-            <w:pPr>
-              <w:widowControl w:val="0"/>
-              <w:spacing w:after="0" w:line="240" w:lineRule="auto"/>
-              <w:rPr>
-                <w:rFonts w:ascii="Calibri" w:eastAsia="Calibri" w:hAnsi="Calibri"/>
-              </w:rPr>
-            </w:pPr>
-            <w:r>
-              <w:rPr>
-                <w:rFonts w:eastAsia="Calibri"/>
-              </w:rPr>
-              <w:t xml:space="preserve">    (2)Habitat destruction: Death by a thousand cuts.</w:t>
-            </w:r>
-          </w:p>
-          <w:p>
-            <w:pPr>
-              <w:widowControl w:val="0"/>
-              <w:spacing w:after="0" w:line="240" w:lineRule="auto"/>
-              <w:rPr>
-                <w:rFonts w:ascii="Calibri" w:eastAsia="Calibri" w:hAnsi="Calibri"/>
-              </w:rPr>
-            </w:pPr>
-            <w:r>
-              <w:rPr>
-                <w:rFonts w:eastAsia="Calibri"/>
-              </w:rPr>
-              <w:t xml:space="preserve">    (3)Reintroduction and rewilding as conservation strategies.</w:t>
-            </w:r>
-          </w:p>
-          <w:p>
-            <w:pPr>
-              <w:widowControl w:val="0"/>
-              <w:spacing w:after="0" w:line="240" w:lineRule="auto"/>
-              <w:rPr>
-                <w:rFonts w:ascii="Calibri" w:eastAsia="Calibri" w:hAnsi="Calibri"/>
-              </w:rPr>
-            </w:pPr>
-            <w:r>
-              <w:rPr>
-                <w:rFonts w:eastAsia="Calibri"/>
-              </w:rPr>
-              <w:t xml:space="preserve">    (4)Climate change: Implications for biodiversity.</w:t>
-            </w:r>
-          </w:p>
-          <w:p>
-            <w:pPr>
-              <w:widowControl w:val="0"/>
-              <w:spacing w:after="0" w:line="240" w:lineRule="auto"/>
-              <w:rPr>
-                <w:rFonts w:ascii="Calibri" w:eastAsia="Calibri" w:hAnsi="Calibri"/>
-              </w:rPr>
-            </w:pPr>
-            <w:r>
-              <w:rPr>
-                <w:rFonts w:eastAsia="Calibri"/>
-              </w:rPr>
-              <w:t>Current Topics in Conservation Biology. MSU, Fall 2021.</w:t>
-            </w:r>
-          </w:p>
-          <w:p>
-            <w:pPr>
-              <w:widowControl w:val="0"/>
-              <w:spacing w:after="0" w:line="240" w:lineRule="auto"/>
-              <w:rPr>
-                <w:rFonts w:ascii="Calibri" w:eastAsia="Calibri" w:hAnsi="Calibri"/>
+              <w:ind w:left="720" w:hanging="720"/>
+              <w:rPr>
+                <w:rFonts w:eastAsia="Calibri"/>
+              </w:rPr>
+            </w:pPr>
+            <w:r>
+              <w:rPr>
+                <w:rFonts w:eastAsia="Calibri"/>
+              </w:rPr>
+              <w:t xml:space="preserve">    (</w:t>
+            </w:r>
+            <w:proofErr w:type="gramStart"/>
+            <w:r>
+              <w:rPr>
+                <w:rFonts w:eastAsia="Calibri"/>
+              </w:rPr>
+              <w:t>1)The</w:t>
+            </w:r>
+            <w:proofErr w:type="gramEnd"/>
+            <w:r>
+              <w:rPr>
+                <w:rFonts w:eastAsia="Calibri"/>
+              </w:rPr>
+              <w:t xml:space="preserve"> IUCN red list of threatened species: How it’s being used.</w:t>
+            </w:r>
+          </w:p>
+          <w:p>
+            <w:pPr>
+              <w:widowControl w:val="0"/>
+              <w:spacing w:after="0" w:line="240" w:lineRule="auto"/>
+              <w:ind w:left="720" w:hanging="720"/>
+              <w:rPr>
+                <w:rFonts w:eastAsia="Calibri"/>
+              </w:rPr>
+            </w:pPr>
+            <w:r>
+              <w:rPr>
+                <w:rFonts w:eastAsia="Calibri"/>
+              </w:rPr>
+              <w:t xml:space="preserve">    (</w:t>
+            </w:r>
+            <w:proofErr w:type="gramStart"/>
+            <w:r>
+              <w:rPr>
+                <w:rFonts w:eastAsia="Calibri"/>
+              </w:rPr>
+              <w:t>2)Habitat</w:t>
+            </w:r>
+            <w:proofErr w:type="gramEnd"/>
+            <w:r>
+              <w:rPr>
+                <w:rFonts w:eastAsia="Calibri"/>
+              </w:rPr>
+              <w:t xml:space="preserve"> destruction: Death by a thousand cuts.</w:t>
+            </w:r>
+          </w:p>
+          <w:p>
+            <w:pPr>
+              <w:widowControl w:val="0"/>
+              <w:spacing w:after="0" w:line="240" w:lineRule="auto"/>
+              <w:ind w:left="720" w:hanging="720"/>
+              <w:rPr>
+                <w:rFonts w:eastAsia="Calibri"/>
+              </w:rPr>
+            </w:pPr>
+            <w:r>
+              <w:rPr>
+                <w:rFonts w:eastAsia="Calibri"/>
+              </w:rPr>
+              <w:t xml:space="preserve">    (</w:t>
+            </w:r>
+            <w:proofErr w:type="gramStart"/>
+            <w:r>
+              <w:rPr>
+                <w:rFonts w:eastAsia="Calibri"/>
+              </w:rPr>
+              <w:t>3)Reintroduction</w:t>
+            </w:r>
+            <w:proofErr w:type="gramEnd"/>
+            <w:r>
+              <w:rPr>
+                <w:rFonts w:eastAsia="Calibri"/>
+              </w:rPr>
+              <w:t xml:space="preserve"> and rewilding as conservation strategies.</w:t>
+            </w:r>
+          </w:p>
+          <w:p>
+            <w:pPr>
+              <w:widowControl w:val="0"/>
+              <w:spacing w:after="0" w:line="240" w:lineRule="auto"/>
+              <w:ind w:left="720" w:hanging="720"/>
+              <w:rPr>
+                <w:rFonts w:eastAsia="Calibri"/>
+              </w:rPr>
+            </w:pPr>
+            <w:r>
+              <w:rPr>
+                <w:rFonts w:eastAsia="Calibri"/>
+              </w:rPr>
+              <w:t xml:space="preserve">    (</w:t>
+            </w:r>
+            <w:proofErr w:type="gramStart"/>
+            <w:r>
+              <w:rPr>
+                <w:rFonts w:eastAsia="Calibri"/>
+              </w:rPr>
+              <w:t>4)Climate</w:t>
+            </w:r>
+            <w:proofErr w:type="gramEnd"/>
+            <w:r>
+              <w:rPr>
+                <w:rFonts w:eastAsia="Calibri"/>
+              </w:rPr>
+              <w:t xml:space="preserve"> change: Implications for biodiversity.</w:t>
+            </w:r>
+          </w:p>
+          <w:p>
+            <w:pPr>
+              <w:widowControl w:val="0"/>
+              <w:spacing w:after="0" w:line="240" w:lineRule="auto"/>
+              <w:ind w:left="720" w:hanging="720"/>
+              <w:rPr>
+                <w:rFonts w:eastAsia="Calibri"/>
+              </w:rPr>
+            </w:pPr>
+            <w:r>
+              <w:rPr>
+                <w:rFonts w:eastAsia="Calibri"/>
+              </w:rPr>
+              <w:t xml:space="preserve">    Current Topics in Conservation Biology. MSU, Fall 2021.</w:t>
+            </w:r>
+          </w:p>
+          <w:p>
+            <w:pPr>
+              <w:widowControl w:val="0"/>
+              <w:spacing w:after="0" w:line="240" w:lineRule="auto"/>
+              <w:ind w:left="720" w:hanging="720"/>
+              <w:rPr>
+                <w:rFonts w:eastAsia="Calibri"/>
               </w:rPr>
             </w:pPr>
             <w:r>
@@ -2056,6 +2265,7 @@
             <w:pPr>
               <w:widowControl w:val="0"/>
               <w:spacing w:after="0" w:line="240" w:lineRule="auto"/>
+              <w:ind w:left="720" w:hanging="720"/>
               <w:rPr>
                 <w:rFonts w:ascii="Calibri" w:eastAsia="Calibri" w:hAnsi="Calibri"/>
               </w:rPr>
@@ -2370,7 +2580,43 @@
               <w:rPr>
                 <w:rFonts w:eastAsia="Calibri"/>
               </w:rPr>
-              <w:t>, Kouba A.J., Burger L.M., et al. Interactions of life history traits, density dependence and responses to climate changes on long-term dynamic patterns of North American breeding bird populations. (In prep for Global Change Biology)</w:t>
+              <w:t>, Kouba</w:t>
+            </w:r>
+            <w:r>
+              <w:rPr>
+                <w:rFonts w:eastAsia="Calibri"/>
+              </w:rPr>
+              <w:t>,</w:t>
+            </w:r>
+            <w:r>
+              <w:rPr>
+                <w:rFonts w:eastAsia="Calibri"/>
+              </w:rPr>
+              <w:t xml:space="preserve"> A.J., Burger</w:t>
+            </w:r>
+            <w:r>
+              <w:rPr>
+                <w:rFonts w:eastAsia="Calibri"/>
+              </w:rPr>
+              <w:t>,</w:t>
+            </w:r>
+            <w:r>
+              <w:rPr>
+                <w:rFonts w:eastAsia="Calibri"/>
+              </w:rPr>
+              <w:t xml:space="preserve"> L.M.,</w:t>
+            </w:r>
+            <w:r>
+              <w:rPr>
+                <w:rFonts w:eastAsia="Calibri"/>
+              </w:rPr>
+              <w:t xml:space="preserve"> Burger, L.W., Colvin, M.E., Wang, G. </w:t>
+            </w:r>
+            <w:r>
+              <w:rPr>
+                <w:rFonts w:eastAsia="Calibri"/>
+              </w:rPr>
+              <w:t>Interactions of life history traits, density dependence and responses to climate changes on long-term dynamic patterns of North American breeding bird populations. (In prep for Global Change Biology)</w:t>
             </w:r>
           </w:p>
           <w:p>
@@ -2386,7 +2632,7 @@
               <w:rPr>
                 <w:rFonts w:eastAsia="Calibri"/>
               </w:rPr>
-              <w:t xml:space="preserve">Yang, H. T., Li, S., Hou, R., </w:t>
+              <w:t xml:space="preserve">Yang, H., Li, S., Hou, R., </w:t>
             </w:r>
             <w:r>
               <w:rPr>
@@ -2394,46 +2640,86 @@
                 <w:b/>
                 <w:bCs/>
               </w:rPr>
-              <w:t>Song, W. T.</w:t>
-            </w:r>
-            <w:r>
-              <w:rPr>
-                <w:rFonts w:eastAsia="Calibri"/>
-              </w:rPr>
-              <w:t>, Fu, Y. W., Li, Y. B., ... &amp; Li, B. G. (2023). Three-dimensional assessment of movement patterns of Sichuan snub-nosed monkeys affected by habitat structure in temperate forests. Zoological Research, 44(2), 361.</w:t>
-            </w:r>
-          </w:p>
-          <w:p>
-            <w:pPr>
-              <w:widowControl w:val="0"/>
-              <w:spacing w:after="0" w:line="240" w:lineRule="auto"/>
-              <w:ind w:left="720" w:hanging="720"/>
-              <w:rPr>
-                <w:rFonts w:ascii="Calibri" w:eastAsia="Calibri" w:hAnsi="Calibri"/>
-              </w:rPr>
-            </w:pPr>
+              <w:t>Song, W</w:t>
+            </w:r>
             <w:r>
               <w:rPr>
                 <w:rFonts w:eastAsia="Calibri"/>
                 <w:b/>
                 <w:bCs/>
               </w:rPr>
+              <w:t>.</w:t>
+            </w:r>
+            <w:r>
+              <w:rPr>
+                <w:rFonts w:eastAsia="Calibri"/>
+              </w:rPr>
+              <w:t>, Fu, Y., Li, Y., ... &amp; Li, B. (2023). Three-dimensional assessment of movement patterns of Sichuan snub-nosed monkeys affected by habitat structure in temperate forests. Zoological Research, 44(2), 361.</w:t>
+            </w:r>
+          </w:p>
+          <w:p>
+            <w:pPr>
+              <w:widowControl w:val="0"/>
+              <w:spacing w:after="0" w:line="240" w:lineRule="auto"/>
+              <w:ind w:left="720" w:hanging="720"/>
+              <w:rPr>
+                <w:rFonts w:ascii="Calibri" w:eastAsia="Calibri" w:hAnsi="Calibri"/>
+              </w:rPr>
+            </w:pPr>
+            <w:r>
+              <w:rPr>
+                <w:rFonts w:eastAsia="Calibri"/>
+                <w:b/>
+                <w:bCs/>
+              </w:rPr>
               <w:t>Song, W.</w:t>
             </w:r>
             <w:r>
               <w:rPr>
                 <w:rFonts w:eastAsia="Calibri"/>
               </w:rPr>
-              <w:t>, Wang, Y., Zhang, X., Zhang, W., . . . &amp; Wan, X. (2017). Influence of Group Size and Foraging Distance on Vigilance Frequency of Brandt′s Vole (</w:t>
-            </w:r>
+              <w:t xml:space="preserve">, Wang, Y., Zhang, X., Zhang, W., </w:t>
+            </w:r>
+            <w:r>
+              <w:rPr>
+                <w:rFonts w:eastAsia="Calibri"/>
+              </w:rPr>
+              <w:t>…</w:t>
+            </w:r>
+            <w:r>
+              <w:rPr>
+                <w:rFonts w:eastAsia="Calibri"/>
+              </w:rPr>
+              <w:t xml:space="preserve"> &amp; Wan, X. (2017). Influence of Group Size and Foraging Distance on Vigilance Frequency of Brandt′s Vole (</w:t>
+            </w:r>
+            <w:proofErr w:type="spellStart"/>
             <w:r>
               <w:rPr>
                 <w:rFonts w:eastAsia="Calibri"/>
                 <w:i/>
                 <w:iCs/>
               </w:rPr>
-              <w:t>Lasiopodomys brandtii</w:t>
-            </w:r>
+              <w:t>Lasiopodomys</w:t>
+            </w:r>
+            <w:proofErr w:type="spellEnd"/>
+            <w:r>
+              <w:rPr>
+                <w:rFonts w:eastAsia="Calibri"/>
+                <w:i/>
+                <w:iCs/>
+              </w:rPr>
+              <w:t xml:space="preserve"> </w:t>
+            </w:r>
+            <w:proofErr w:type="spellStart"/>
+            <w:r>
+              <w:rPr>
+                <w:rFonts w:eastAsia="Calibri"/>
+                <w:i/>
+                <w:iCs/>
+              </w:rPr>
+              <w:t>brandtii</w:t>
+            </w:r>
+            <w:proofErr w:type="spellEnd"/>
             <w:r>
               <w:rPr>
                 <w:rFonts w:eastAsia="Calibri"/>
@@ -2462,7 +2748,26 @@
               <w:rPr>
                 <w:rFonts w:eastAsia="Calibri"/>
               </w:rPr>
-              <w:t xml:space="preserve">, Wang, Y., Sai, N., . . . &amp; Zhang, Z. (2016). Numerical Response of Hawks Density to the Rodents Density in Typical Steppe. Chinese Journal of Zoology, 51(4): 529-535. </w:t>
+              <w:t xml:space="preserve">, Wang, Y., Sai, N., </w:t>
+            </w:r>
+            <w:r>
+              <w:rPr>
+                <w:rFonts w:eastAsia="Calibri"/>
+              </w:rPr>
+              <w:t>…</w:t>
+            </w:r>
+            <w:r>
+              <w:rPr>
+                <w:rFonts w:eastAsia="Calibri"/>
+              </w:rPr>
+              <w:t xml:space="preserve"> &amp; Zhang, Z. (2016). Numerical Response of Hawks Density to the Rodents Density in Typical </w:t>
+            </w:r>
+            <w:r>
+              <w:rPr>
+                <w:rFonts w:eastAsia="Calibri"/>
+              </w:rPr>
+              <w:lastRenderedPageBreak/>
+              <w:t xml:space="preserve">Steppe. Chinese Journal of Zoology, 51(4): 529-535. </w:t>
             </w:r>
           </w:p>
         </w:tc>
@@ -2592,7 +2897,25 @@
                 <w:b/>
                 <w:bCs/>
               </w:rPr>
-              <w:t>Dr. Guiming Wang</w:t>
+              <w:t xml:space="preserve">Dr. </w:t>
+            </w:r>
+            <w:proofErr w:type="spellStart"/>
+            <w:r>
+              <w:rPr>
+                <w:rFonts w:eastAsia="Calibri"/>
+                <w:b/>
+                <w:bCs/>
+              </w:rPr>
+              <w:t>Guiming</w:t>
+            </w:r>
+            <w:proofErr w:type="spellEnd"/>
+            <w:r>
+              <w:rPr>
+                <w:rFonts w:eastAsia="Calibri"/>
+                <w:b/>
+                <w:bCs/>
+              </w:rPr>
+              <w:t xml:space="preserve"> Wang</w:t>
             </w:r>
             <w:r>
               <w:rPr>
@@ -2613,15 +2936,15 @@
               <w:rPr>
                 <w:rFonts w:eastAsia="Calibri"/>
               </w:rPr>
-              <w:t>Professor, Department of Wildlife, Fisheries and Aquaculture, Mississippi State University</w:t>
-            </w:r>
-          </w:p>
-          <w:p>
-            <w:pPr>
-              <w:widowControl w:val="0"/>
-              <w:spacing w:after="0" w:line="240" w:lineRule="auto"/>
-              <w:rPr>
-                <w:rFonts w:ascii="Calibri" w:eastAsia="Calibri" w:hAnsi="Calibri"/>
+              <w:t>Professor, Mississippi State University</w:t>
+            </w:r>
+          </w:p>
+          <w:p>
+            <w:pPr>
+              <w:widowControl w:val="0"/>
+              <w:spacing w:after="0" w:line="240" w:lineRule="auto"/>
+              <w:rPr>
+                <w:rFonts w:eastAsia="Calibri"/>
               </w:rPr>
             </w:pPr>
             <w:r>
@@ -2630,6 +2953,15 @@
               </w:rPr>
               <w:t>guiming.wang@msstate.edu</w:t>
             </w:r>
+          </w:p>
+          <w:p>
+            <w:pPr>
+              <w:widowControl w:val="0"/>
+              <w:spacing w:after="0" w:line="240" w:lineRule="auto"/>
+              <w:rPr>
+                <w:rFonts w:ascii="Calibri" w:eastAsia="Calibri" w:hAnsi="Calibri"/>
+              </w:rPr>
+            </w:pPr>
           </w:p>
         </w:tc>
       </w:tr>
@@ -2662,7 +2994,25 @@
                 <w:b/>
                 <w:bCs/>
               </w:rPr>
-              <w:t xml:space="preserve">Dr. Xinrong Wan </w:t>
+              <w:t xml:space="preserve">Dr. </w:t>
+            </w:r>
+            <w:proofErr w:type="spellStart"/>
+            <w:r>
+              <w:rPr>
+                <w:rFonts w:eastAsia="Calibri"/>
+                <w:b/>
+                <w:bCs/>
+              </w:rPr>
+              <w:t>Xinrong</w:t>
+            </w:r>
+            <w:proofErr w:type="spellEnd"/>
+            <w:r>
+              <w:rPr>
+                <w:rFonts w:eastAsia="Calibri"/>
+                <w:b/>
+                <w:bCs/>
+              </w:rPr>
+              <w:t xml:space="preserve"> Wan </w:t>
             </w:r>
             <w:r>
               <w:rPr>
@@ -2691,7 +3041,7 @@
               <w:widowControl w:val="0"/>
               <w:spacing w:after="0" w:line="240" w:lineRule="auto"/>
               <w:rPr>
-                <w:rFonts w:ascii="Calibri" w:eastAsia="Calibri" w:hAnsi="Calibri"/>
+                <w:rFonts w:eastAsia="Calibri"/>
               </w:rPr>
             </w:pPr>
             <w:r>
@@ -2700,6 +3050,15 @@
               </w:rPr>
               <w:t>wanxr@ioz.ac.cn</w:t>
             </w:r>
+          </w:p>
+          <w:p>
+            <w:pPr>
+              <w:widowControl w:val="0"/>
+              <w:spacing w:after="0" w:line="240" w:lineRule="auto"/>
+              <w:rPr>
+                <w:rFonts w:ascii="Calibri" w:eastAsia="Calibri" w:hAnsi="Calibri"/>
+              </w:rPr>
+            </w:pPr>
           </w:p>
         </w:tc>
       </w:tr>
@@ -2732,43 +3091,186 @@
                 <w:b/>
                 <w:bCs/>
               </w:rPr>
-              <w:t>Dr. Ryo Ogawa</w:t>
-            </w:r>
-            <w:r>
-              <w:rPr>
-                <w:rFonts w:eastAsia="Calibri"/>
-              </w:rPr>
-              <w:t xml:space="preserve"> (lab colleague)</w:t>
-            </w:r>
-          </w:p>
-          <w:p>
-            <w:pPr>
-              <w:widowControl w:val="0"/>
-              <w:spacing w:after="0" w:line="240" w:lineRule="auto"/>
-              <w:rPr>
-                <w:rFonts w:ascii="Calibri" w:eastAsia="Calibri" w:hAnsi="Calibri"/>
-              </w:rPr>
-            </w:pPr>
-            <w:r>
-              <w:rPr>
-                <w:rFonts w:eastAsia="Calibri"/>
-              </w:rPr>
-              <w:t>Postdoc, Chair of Computational Landscape Ecology, Technische Universität Dresden, Germany</w:t>
-            </w:r>
-          </w:p>
-          <w:p>
-            <w:pPr>
-              <w:widowControl w:val="0"/>
-              <w:spacing w:after="0" w:line="240" w:lineRule="auto"/>
-              <w:rPr>
-                <w:rFonts w:ascii="Calibri" w:eastAsia="Calibri" w:hAnsi="Calibri"/>
-              </w:rPr>
-            </w:pPr>
-            <w:r>
-              <w:rPr>
-                <w:rFonts w:eastAsia="Calibri"/>
-              </w:rPr>
-              <w:t>ryo.ogawa@tu-dresden.de</w:t>
+              <w:t xml:space="preserve">Dr. </w:t>
+            </w:r>
+            <w:proofErr w:type="spellStart"/>
+            <w:r>
+              <w:rPr>
+                <w:rFonts w:eastAsia="Calibri"/>
+                <w:b/>
+                <w:bCs/>
+              </w:rPr>
+              <w:t>Xueyan</w:t>
+            </w:r>
+            <w:proofErr w:type="spellEnd"/>
+            <w:r>
+              <w:rPr>
+                <w:rFonts w:eastAsia="Calibri"/>
+                <w:b/>
+                <w:bCs/>
+              </w:rPr>
+              <w:t xml:space="preserve"> Shan </w:t>
+            </w:r>
+            <w:r>
+              <w:rPr>
+                <w:rFonts w:eastAsia="Calibri"/>
+              </w:rPr>
+              <w:t>(Project advisor)</w:t>
+            </w:r>
+          </w:p>
+          <w:p>
+            <w:pPr>
+              <w:widowControl w:val="0"/>
+              <w:spacing w:after="0" w:line="240" w:lineRule="auto"/>
+              <w:rPr>
+                <w:rFonts w:eastAsia="Calibri"/>
+              </w:rPr>
+            </w:pPr>
+            <w:r>
+              <w:rPr>
+                <w:rFonts w:eastAsia="Calibri"/>
+              </w:rPr>
+              <w:t>Associate Research Professor</w:t>
+            </w:r>
+            <w:r>
+              <w:rPr>
+                <w:rFonts w:eastAsia="Calibri"/>
+              </w:rPr>
+              <w:t xml:space="preserve">, </w:t>
+            </w:r>
+            <w:r>
+              <w:rPr>
+                <w:rFonts w:eastAsia="Calibri"/>
+              </w:rPr>
+              <w:t>Mississippi State University</w:t>
+            </w:r>
+          </w:p>
+          <w:p>
+            <w:pPr>
+              <w:widowControl w:val="0"/>
+              <w:spacing w:after="0" w:line="240" w:lineRule="auto"/>
+              <w:rPr>
+                <w:rFonts w:eastAsia="Calibri"/>
+              </w:rPr>
+            </w:pPr>
+            <w:r>
+              <w:rPr>
+                <w:rFonts w:eastAsia="Calibri"/>
+              </w:rPr>
+              <w:t>xshan@bch.msstate.edu</w:t>
+            </w:r>
+          </w:p>
+          <w:p>
+            <w:pPr>
+              <w:widowControl w:val="0"/>
+              <w:spacing w:after="0" w:line="240" w:lineRule="auto"/>
+              <w:rPr>
+                <w:rFonts w:eastAsia="Calibri"/>
+                <w:b/>
+                <w:bCs/>
+              </w:rPr>
+            </w:pPr>
+          </w:p>
+        </w:tc>
+      </w:tr>
+      <w:tr>
+        <w:trPr>
+          <w:trHeight w:val="816"/>
+        </w:trPr>
+        <w:tc>
+          <w:tcPr>
+            <w:tcW w:w="11520" w:type="dxa"/>
+            <w:gridSpan w:val="3"/>
+            <w:tcBorders>
+              <w:top w:val="nil"/>
+              <w:left w:val="nil"/>
+              <w:bottom w:val="nil"/>
+              <w:right w:val="nil"/>
+            </w:tcBorders>
+          </w:tcPr>
+          <w:p>
+            <w:pPr>
+              <w:widowControl w:val="0"/>
+              <w:spacing w:after="0" w:line="240" w:lineRule="auto"/>
+              <w:rPr>
+                <w:rFonts w:ascii="Calibri" w:eastAsia="Calibri" w:hAnsi="Calibri"/>
+              </w:rPr>
+            </w:pPr>
+            <w:r>
+              <w:rPr>
+                <w:rFonts w:eastAsia="Calibri"/>
+                <w:b/>
+                <w:bCs/>
+              </w:rPr>
+              <w:t xml:space="preserve">Dr. </w:t>
+            </w:r>
+            <w:r>
+              <w:rPr>
+                <w:rFonts w:eastAsia="Calibri"/>
+                <w:b/>
+                <w:bCs/>
+              </w:rPr>
+              <w:t xml:space="preserve">Sandra Correa </w:t>
+            </w:r>
+            <w:r>
+              <w:rPr>
+                <w:rFonts w:eastAsia="Calibri"/>
+              </w:rPr>
+              <w:t>(</w:t>
+            </w:r>
+            <w:r>
+              <w:rPr>
+                <w:rFonts w:eastAsia="Calibri"/>
+              </w:rPr>
+              <w:t>TA advisor</w:t>
+            </w:r>
+            <w:r>
+              <w:rPr>
+                <w:rFonts w:eastAsia="Calibri"/>
+              </w:rPr>
+              <w:t>)</w:t>
+            </w:r>
+          </w:p>
+          <w:p>
+            <w:pPr>
+              <w:widowControl w:val="0"/>
+              <w:spacing w:after="0" w:line="240" w:lineRule="auto"/>
+              <w:rPr>
+                <w:rFonts w:ascii="Calibri" w:eastAsia="Calibri" w:hAnsi="Calibri"/>
+              </w:rPr>
+            </w:pPr>
+            <w:r>
+              <w:rPr>
+                <w:rFonts w:eastAsia="Calibri"/>
+              </w:rPr>
+              <w:t>Associate Professor</w:t>
+            </w:r>
+            <w:r>
+              <w:rPr>
+                <w:rFonts w:eastAsia="Calibri"/>
+              </w:rPr>
+              <w:t xml:space="preserve">, </w:t>
+            </w:r>
+            <w:r>
+              <w:rPr>
+                <w:rFonts w:eastAsia="Calibri"/>
+              </w:rPr>
+              <w:t>Mississippi State University</w:t>
+            </w:r>
+          </w:p>
+          <w:p>
+            <w:pPr>
+              <w:widowControl w:val="0"/>
+              <w:spacing w:after="0" w:line="240" w:lineRule="auto"/>
+              <w:rPr>
+                <w:rFonts w:ascii="Calibri" w:eastAsia="Calibri" w:hAnsi="Calibri"/>
+              </w:rPr>
+            </w:pPr>
+            <w:r>
+              <w:rPr>
+                <w:rFonts w:eastAsia="Calibri"/>
+              </w:rPr>
+              <w:t>sbc257@msstate.edu</w:t>
             </w:r>
           </w:p>
         </w:tc>
@@ -2862,7 +3364,19 @@
       <w:rPr>
         <w:color w:val="BFBFBF" w:themeColor="background1" w:themeShade="BF"/>
       </w:rPr>
-      <w:t xml:space="preserve">         July 2024</w:t>
+      <w:t xml:space="preserve">         </w:t>
+    </w:r>
+    <w:r>
+      <w:rPr>
+        <w:color w:val="BFBFBF" w:themeColor="background1" w:themeShade="BF"/>
+      </w:rPr>
+      <w:t>Dec</w:t>
+    </w:r>
+    <w:r>
+      <w:rPr>
+        <w:color w:val="BFBFBF" w:themeColor="background1" w:themeShade="BF"/>
+      </w:rPr>
+      <w:t xml:space="preserve"> 2024</w:t>
     </w:r>
   </w:p>
 </w:hdr>

</xml_diff>